<commit_message>
Lettres vague 5 A
Co-Authored-By: Claude Opus 5.5 <noreply@anthropic.com>
Claude-Session: https://claude.ai/code/session_01XoHpjKarrpJdz34UzoFnz2
</commit_message>
<xml_diff>
--- a/lettres/CoverLetter_HoulihanLokey_CorporateFinanceMA_Paris.docx
+++ b/lettres/CoverLetter_HoulihanLokey_CorporateFinanceMA_Paris.docx
@@ -13,105 +13,105 @@
           <w:sz w:val="22"/>
           <w:szCs w:val="22"/>
         </w:rPr>
-        <w:t xml:space="preserve">Dear Hiring Team,</w:t>
-      </w:r>
-    </w:p>
-    <w:p>
-      <w:pPr>
-        <w:spacing w:after="200"/>
-        <w:jc w:val="both"/>
-      </w:pPr>
-      <w:r>
-        <w:rPr>
-          <w:rFonts w:ascii="Arial" w:cs="Arial" w:eastAsia="Arial" w:hAnsi="Arial"/>
-          <w:sz w:val="22"/>
-          <w:szCs w:val="22"/>
-        </w:rPr>
-        <w:t xml:space="preserve">Houlihan Lokey's Corporate Finance team in Paris stands out to me for the quality of its M&amp;A advisory work and for the way interns are trained on live assignments from the first weeks. I am applying for the six month Off Cycle Internship in Corporate Finance (M&amp;A) because I want to build my career in advisory, where rigour in financial modelling and valuation directly shapes client decisions.</w:t>
-      </w:r>
-    </w:p>
-    <w:p>
-      <w:pPr>
-        <w:spacing w:after="200"/>
-        <w:jc w:val="both"/>
-      </w:pPr>
-      <w:r>
-        <w:rPr>
-          <w:rFonts w:ascii="Arial" w:cs="Arial" w:eastAsia="Arial" w:hAnsi="Arial"/>
-          <w:sz w:val="22"/>
-          <w:szCs w:val="22"/>
-        </w:rPr>
-        <w:t xml:space="preserve">I am currently completing a six month internship as Wealth Management Intern at L&amp;A Finance in Paris, an independent wealth management advisory firm within the Groupe Rayne, where I analyse and structure financial transactions across various investment products, conduct daily market monitoring and contribute to the preparation of technical client materials.</w:t>
-      </w:r>
-    </w:p>
-    <w:p>
-      <w:pPr>
-        <w:spacing w:after="200"/>
-        <w:jc w:val="both"/>
-      </w:pPr>
-      <w:r>
-        <w:rPr>
-          <w:rFonts w:ascii="Arial" w:cs="Arial" w:eastAsia="Arial" w:hAnsi="Arial"/>
-          <w:sz w:val="22"/>
-          <w:szCs w:val="22"/>
-        </w:rPr>
-        <w:t xml:space="preserve">My training at ESSCA, my Bloomberg Market Concepts certification and my personal projects have given me a solid base in valuation and market analysis. Using AI tools, I designed a quantitative equity strategy that achieved a Sharpe ratio of 0.91 against the SPY over a ten year backtest, and I built a live trading system on Polymarket across eight exchanges, which I shut down once the data showed no net edge. These projects taught me to test a thesis against the numbers, to document assumptions and to accept the conclusion the analysis gives, which is the discipline I expect to apply to models and valuation work.</w:t>
-      </w:r>
-    </w:p>
-    <w:p>
-      <w:pPr>
-        <w:spacing w:after="200"/>
-        <w:jc w:val="both"/>
-      </w:pPr>
-      <w:r>
-        <w:rPr>
-          <w:rFonts w:ascii="Arial" w:cs="Arial" w:eastAsia="Arial" w:hAnsi="Arial"/>
-          <w:sz w:val="22"/>
-          <w:szCs w:val="22"/>
-        </w:rPr>
-        <w:t xml:space="preserve">My commercial track reinforces this analytical side. At Mecanicus, I handled more than ten over the counter transactions from €50k to €500k and managed €3M of inventory, which taught me to negotiate, price an asset and close with demanding counterparties. Alongside my studies, I have run an independent resale activity since 2018, generating more than €10k of revenue at a net margin of about 50%, with full ownership of sourcing, pricing and client relations.</w:t>
-      </w:r>
-    </w:p>
-    <w:p>
-      <w:pPr>
-        <w:spacing w:after="200"/>
-        <w:jc w:val="both"/>
-      </w:pPr>
-      <w:r>
-        <w:rPr>
-          <w:rFonts w:ascii="Arial" w:cs="Arial" w:eastAsia="Arial" w:hAnsi="Arial"/>
-          <w:sz w:val="22"/>
-          <w:szCs w:val="22"/>
-        </w:rPr>
-        <w:t xml:space="preserve">I am available from January 2027 for six months.</w:t>
-      </w:r>
-    </w:p>
-    <w:p>
-      <w:pPr>
-        <w:spacing w:after="200"/>
-        <w:jc w:val="both"/>
-      </w:pPr>
-      <w:r>
-        <w:rPr>
-          <w:rFonts w:ascii="Arial" w:cs="Arial" w:eastAsia="Arial" w:hAnsi="Arial"/>
-          <w:sz w:val="22"/>
-          <w:szCs w:val="22"/>
-        </w:rPr>
-        <w:t xml:space="preserve">I would be glad to discuss how I can contribute to your M&amp;A team and would welcome the opportunity to meet for an interview.</w:t>
-      </w:r>
-    </w:p>
-    <w:p>
-      <w:pPr>
-        <w:spacing w:after="200"/>
-        <w:jc w:val="both"/>
-      </w:pPr>
-      <w:r>
-        <w:rPr>
-          <w:rFonts w:ascii="Arial" w:cs="Arial" w:eastAsia="Arial" w:hAnsi="Arial"/>
-          <w:sz w:val="22"/>
-          <w:szCs w:val="22"/>
-        </w:rPr>
-        <w:t xml:space="preserve">Yours sincerely,</w:t>
+        <w:t xml:space="preserve">Madame, Monsieur,</w:t>
+      </w:r>
+    </w:p>
+    <w:p>
+      <w:pPr>
+        <w:spacing w:after="200"/>
+        <w:jc w:val="both"/>
+      </w:pPr>
+      <w:r>
+        <w:rPr>
+          <w:rFonts w:ascii="Arial" w:cs="Arial" w:eastAsia="Arial" w:hAnsi="Arial"/>
+          <w:sz w:val="22"/>
+          <w:szCs w:val="22"/>
+        </w:rPr>
+        <w:t xml:space="preserve">Houlihan Lokey est une référence mondiale du conseil en fusions acquisitions, et son équipe de Paris me permettrait d'apprendre le métier au contact de dossiers concrets. Je vous adresse ma candidature pour le stage de six mois en Corporate Finance (M&amp;A) à Paris.</w:t>
+      </w:r>
+    </w:p>
+    <w:p>
+      <w:pPr>
+        <w:spacing w:after="200"/>
+        <w:jc w:val="both"/>
+      </w:pPr>
+      <w:r>
+        <w:rPr>
+          <w:rFonts w:ascii="Arial" w:cs="Arial" w:eastAsia="Arial" w:hAnsi="Arial"/>
+          <w:sz w:val="22"/>
+          <w:szCs w:val="22"/>
+        </w:rPr>
+        <w:t xml:space="preserve">Je réalise actuellement un stage de six mois en tant qu'Assistant Patrimonial chez L&amp;A Finance à Paris, cabinet de conseil en gestion de patrimoine du Groupe Rayne, où j'analyse et structure des transactions financières sur différents produits d'investissement, conduis une veille de marché quotidienne et contribue à la rédaction de supports techniques à destination des clients.</w:t>
+      </w:r>
+    </w:p>
+    <w:p>
+      <w:pPr>
+        <w:spacing w:after="200"/>
+        <w:jc w:val="both"/>
+      </w:pPr>
+      <w:r>
+        <w:rPr>
+          <w:rFonts w:ascii="Arial" w:cs="Arial" w:eastAsia="Arial" w:hAnsi="Arial"/>
+          <w:sz w:val="22"/>
+          <w:szCs w:val="22"/>
+        </w:rPr>
+        <w:t xml:space="preserve">Ma formation de Master en finance à l'ESSCA et ma certification Bloomberg Market Concepts m'ont donné de solides bases en valorisation, en analyse financière et en modélisation. En m'appuyant sur des outils d'IA, j'ai conçu une stratégie algorithmique atteignant un ratio de Sharpe de 0,91 par rapport au SPY sur dix ans de backtest, et construit un système de trading en direct sur Polymarket, que j'ai arrêté lorsque les résultats ont montré l'absence d'avantage net. Ces projets m'ont appris la rigueur, la structuration de l'analyse et l'honnêteté intellectuelle face aux chiffres.</w:t>
+      </w:r>
+    </w:p>
+    <w:p>
+      <w:pPr>
+        <w:spacing w:after="200"/>
+        <w:jc w:val="both"/>
+      </w:pPr>
+      <w:r>
+        <w:rPr>
+          <w:rFonts w:ascii="Arial" w:cs="Arial" w:eastAsia="Arial" w:hAnsi="Arial"/>
+          <w:sz w:val="22"/>
+          <w:szCs w:val="22"/>
+        </w:rPr>
+        <w:t xml:space="preserve">Mon parcours est aussi entrepreneurial. Chez Mecanicus, j'ai participé à plus de dix transactions de gré à gré comprises entre 50 000 € et 500 000 € et géré 3 M€ de stock, et depuis 2018 je développe une activité de revente indépendante ayant généré plus de 10 000 € de chiffre d'affaires pour une marge nette d'environ 50 %. J'y ai appris à négocier, à tenir des délais serrés et à travailler avec exigence, qualités renforcées par ma pratique du sport de compétition.</w:t>
+      </w:r>
+    </w:p>
+    <w:p>
+      <w:pPr>
+        <w:spacing w:after="200"/>
+        <w:jc w:val="both"/>
+      </w:pPr>
+      <w:r>
+        <w:rPr>
+          <w:rFonts w:ascii="Arial" w:cs="Arial" w:eastAsia="Arial" w:hAnsi="Arial"/>
+          <w:sz w:val="22"/>
+          <w:szCs w:val="22"/>
+        </w:rPr>
+        <w:t xml:space="preserve">Je suis disponible à partir de janvier 2027 pour une durée de six mois.</w:t>
+      </w:r>
+    </w:p>
+    <w:p>
+      <w:pPr>
+        <w:spacing w:after="200"/>
+        <w:jc w:val="both"/>
+      </w:pPr>
+      <w:r>
+        <w:rPr>
+          <w:rFonts w:ascii="Arial" w:cs="Arial" w:eastAsia="Arial" w:hAnsi="Arial"/>
+          <w:sz w:val="22"/>
+          <w:szCs w:val="22"/>
+        </w:rPr>
+        <w:t xml:space="preserve">Je serais ravi d'échanger avec vous sur ma motivation et sur ce que je pourrais apporter à l'équipe.</w:t>
+      </w:r>
+    </w:p>
+    <w:p>
+      <w:pPr>
+        <w:spacing w:after="200"/>
+        <w:jc w:val="both"/>
+      </w:pPr>
+      <w:r>
+        <w:rPr>
+          <w:rFonts w:ascii="Arial" w:cs="Arial" w:eastAsia="Arial" w:hAnsi="Arial"/>
+          <w:sz w:val="22"/>
+          <w:szCs w:val="22"/>
+        </w:rPr>
+        <w:t xml:space="preserve">Dans l'attente de votre retour, veuillez agréer, Madame, Monsieur, l'expression de mes salutations distinguées.</w:t>
       </w:r>
     </w:p>
     <w:p>

</xml_diff>